<commit_message>
feat: AT all questions updated
</commit_message>
<xml_diff>
--- a/AT/documentos/samuel_hermany_DR1_AT.docx
+++ b/AT/documentos/samuel_hermany_DR1_AT.docx
@@ -4463,12 +4463,8 @@
     </w:sdt>
     <w:p>
       <w:pPr>
-        <w:pStyle w:val="2"/>
-        <w:numPr>
-          <w:ilvl w:val="0"/>
-          <w:numId w:val="0"/>
-        </w:numPr>
-        <w:ind w:left="720" w:leftChars="0"/>
+        <w:pStyle w:val="3"/>
+        <w:bidi w:val="0"/>
         <w:rPr>
           <w:rFonts w:hint="default"/>
           <w:lang w:val="pt-BR"/>
@@ -4479,7 +4475,7 @@
           <w:rFonts w:hint="default"/>
           <w:lang w:val="pt-BR"/>
         </w:rPr>
-        <w:t>Link</w:t>
+        <w:t>Link com todas as questões</w:t>
       </w:r>
     </w:p>
     <w:p>
@@ -4489,6 +4485,195 @@
           <w:lang w:val="pt-BR"/>
         </w:rPr>
       </w:pPr>
+      <w:r>
+        <w:rPr>
+          <w:rFonts w:hint="default"/>
+          <w:lang w:val="pt-BR"/>
+        </w:rPr>
+        <w:fldChar w:fldCharType="begin"/>
+      </w:r>
+      <w:r>
+        <w:rPr>
+          <w:rFonts w:hint="default"/>
+          <w:lang w:val="pt-BR"/>
+        </w:rPr>
+        <w:instrText xml:space="preserve"> HYPERLINK "https://colab.research.google.com/drive/15v8L0KqyhQW5OkDE0ZV19Kc0r9DZeLj9?usp=drive_link" </w:instrText>
+      </w:r>
+      <w:r>
+        <w:rPr>
+          <w:rFonts w:hint="default"/>
+          <w:lang w:val="pt-BR"/>
+        </w:rPr>
+        <w:fldChar w:fldCharType="separate"/>
+      </w:r>
+      <w:r>
+        <w:rPr>
+          <w:rStyle w:val="11"/>
+          <w:rFonts w:hint="default"/>
+          <w:lang w:val="pt-BR"/>
+        </w:rPr>
+        <w:t>https://colab.research.google.com/drive/15v8L0KqyhQW5OkDE0ZV19Kc0r9DZeLj9?usp=drive_link</w:t>
+      </w:r>
+      <w:r>
+        <w:rPr>
+          <w:rFonts w:hint="default"/>
+          <w:lang w:val="pt-BR"/>
+        </w:rPr>
+        <w:fldChar w:fldCharType="end"/>
+      </w:r>
+    </w:p>
+    <w:p>
+      <w:pPr>
+        <w:rPr>
+          <w:rFonts w:hint="default"/>
+          <w:lang w:val="pt-BR"/>
+        </w:rPr>
+      </w:pPr>
+    </w:p>
+    <w:p>
+      <w:pPr>
+        <w:pStyle w:val="3"/>
+        <w:bidi w:val="0"/>
+        <w:rPr>
+          <w:rFonts w:hint="default"/>
+          <w:lang w:val="pt-BR"/>
+        </w:rPr>
+      </w:pPr>
+      <w:r>
+        <w:rPr>
+          <w:rFonts w:hint="default"/>
+          <w:lang w:val="pt-BR"/>
+        </w:rPr>
+        <w:t>Link do GitHub</w:t>
+      </w:r>
+    </w:p>
+    <w:p>
+      <w:pPr>
+        <w:rPr>
+          <w:rFonts w:hint="default"/>
+          <w:lang w:val="pt-BR"/>
+        </w:rPr>
+      </w:pPr>
+      <w:r>
+        <w:rPr>
+          <w:rFonts w:hint="default"/>
+          <w:lang w:val="pt-BR"/>
+        </w:rPr>
+        <w:t>Com cada questão individual</w:t>
+      </w:r>
+    </w:p>
+    <w:p>
+      <w:pPr>
+        <w:rPr>
+          <w:rFonts w:hint="default"/>
+          <w:lang w:val="pt-BR"/>
+        </w:rPr>
+      </w:pPr>
+      <w:r>
+        <w:rPr>
+          <w:rFonts w:hint="default"/>
+          <w:lang w:val="pt-BR"/>
+        </w:rPr>
+        <w:fldChar w:fldCharType="begin"/>
+      </w:r>
+      <w:r>
+        <w:rPr>
+          <w:rFonts w:hint="default"/>
+          <w:lang w:val="pt-BR"/>
+        </w:rPr>
+        <w:instrText xml:space="preserve"> HYPERLINK "https://github.com/faculdade-infnet/VI-1-velocidade-qualidade-com-algoritmos/tree/main/AT" </w:instrText>
+      </w:r>
+      <w:r>
+        <w:rPr>
+          <w:rFonts w:hint="default"/>
+          <w:lang w:val="pt-BR"/>
+        </w:rPr>
+        <w:fldChar w:fldCharType="separate"/>
+      </w:r>
+      <w:r>
+        <w:rPr>
+          <w:rStyle w:val="11"/>
+          <w:rFonts w:hint="default"/>
+          <w:lang w:val="pt-BR"/>
+        </w:rPr>
+        <w:t>https://github.com/faculdade-infnet/VI-1-velocidade-qualidade-com-algoritmos/tree/main/AT</w:t>
+      </w:r>
+      <w:r>
+        <w:rPr>
+          <w:rFonts w:hint="default"/>
+          <w:lang w:val="pt-BR"/>
+        </w:rPr>
+        <w:fldChar w:fldCharType="end"/>
+      </w:r>
+    </w:p>
+    <w:p>
+      <w:pPr>
+        <w:rPr>
+          <w:rFonts w:hint="default"/>
+          <w:lang w:val="pt-BR"/>
+        </w:rPr>
+      </w:pPr>
+    </w:p>
+    <w:p>
+      <w:pPr>
+        <w:pStyle w:val="3"/>
+        <w:bidi w:val="0"/>
+        <w:rPr>
+          <w:rFonts w:hint="default"/>
+          <w:lang w:val="pt-BR"/>
+        </w:rPr>
+      </w:pPr>
+      <w:r>
+        <w:rPr>
+          <w:rFonts w:hint="default"/>
+          <w:lang w:val="pt-BR"/>
+        </w:rPr>
+        <w:t>Link do video</w:t>
+      </w:r>
+    </w:p>
+    <w:p>
+      <w:pPr>
+        <w:rPr>
+          <w:rFonts w:hint="default"/>
+          <w:lang w:val="pt-BR"/>
+        </w:rPr>
+      </w:pPr>
+      <w:r>
+        <w:rPr>
+          <w:rFonts w:hint="default"/>
+          <w:lang w:val="pt-BR"/>
+        </w:rPr>
+        <w:fldChar w:fldCharType="begin"/>
+      </w:r>
+      <w:r>
+        <w:rPr>
+          <w:rFonts w:hint="default"/>
+          <w:lang w:val="pt-BR"/>
+        </w:rPr>
+        <w:instrText xml:space="preserve"> HYPERLINK "https://drive.google.com/file/d/1f3Nqeb1Y0r6jIqkq0lHTd_TcDv1sDDnl/view?usp=drive_link" </w:instrText>
+      </w:r>
+      <w:r>
+        <w:rPr>
+          <w:rFonts w:hint="default"/>
+          <w:lang w:val="pt-BR"/>
+        </w:rPr>
+        <w:fldChar w:fldCharType="separate"/>
+      </w:r>
+      <w:r>
+        <w:rPr>
+          <w:rStyle w:val="11"/>
+          <w:rFonts w:hint="default"/>
+          <w:lang w:val="pt-BR"/>
+        </w:rPr>
+        <w:t>https://drive.google.com/file/d/1f3Nqeb1Y0r6jIqkq0lHTd_TcDv1sDDnl/view?usp=drive_link</w:t>
+      </w:r>
+      <w:r>
+        <w:rPr>
+          <w:rFonts w:hint="default"/>
+          <w:lang w:val="pt-BR"/>
+        </w:rPr>
+        <w:fldChar w:fldCharType="end"/>
+      </w:r>
     </w:p>
     <w:p>
       <w:pPr>
@@ -4517,7 +4702,7 @@
         <w:bidi w:val="0"/>
         <w:adjustRightInd/>
         <w:snapToGrid/>
-        <w:spacing w:before="240" w:line="260" w:lineRule="auto"/>
+        <w:spacing w:before="200" w:line="260" w:lineRule="auto"/>
         <w:textAlignment w:val="auto"/>
         <w:rPr>
           <w:rFonts w:hint="default"/>
@@ -4545,7 +4730,7 @@
         <w:bidi w:val="0"/>
         <w:adjustRightInd/>
         <w:snapToGrid/>
-        <w:spacing w:before="240" w:line="260" w:lineRule="auto"/>
+        <w:spacing w:before="200" w:line="260" w:lineRule="auto"/>
         <w:textAlignment w:val="auto"/>
         <w:rPr>
           <w:rFonts w:hint="default"/>
@@ -4580,7 +4765,7 @@
         <w:bidi w:val="0"/>
         <w:adjustRightInd/>
         <w:snapToGrid/>
-        <w:spacing w:before="240" w:line="260" w:lineRule="auto"/>
+        <w:spacing w:before="200" w:line="260" w:lineRule="auto"/>
         <w:textAlignment w:val="auto"/>
         <w:rPr>
           <w:rFonts w:hint="default"/>
@@ -4608,29 +4793,7 @@
         <w:bidi w:val="0"/>
         <w:adjustRightInd/>
         <w:snapToGrid/>
-        <w:spacing w:before="240" w:line="260" w:lineRule="auto"/>
-        <w:textAlignment w:val="auto"/>
-        <w:rPr>
-          <w:rFonts w:hint="default"/>
-        </w:rPr>
-      </w:pPr>
-    </w:p>
-    <w:p>
-      <w:pPr>
-        <w:keepNext w:val="0"/>
-        <w:keepLines w:val="0"/>
-        <w:pageBreakBefore w:val="0"/>
-        <w:widowControl/>
-        <w:kinsoku/>
-        <w:wordWrap/>
-        <w:overflowPunct/>
-        <w:topLinePunct w:val="0"/>
-        <w:autoSpaceDE/>
-        <w:autoSpaceDN/>
-        <w:bidi w:val="0"/>
-        <w:adjustRightInd/>
-        <w:snapToGrid/>
-        <w:spacing w:before="240" w:line="260" w:lineRule="auto"/>
+        <w:spacing w:before="200" w:line="260" w:lineRule="auto"/>
         <w:textAlignment w:val="auto"/>
         <w:rPr>
           <w:rFonts w:hint="default"/>
@@ -4671,7 +4834,7 @@
         <w:bidi w:val="0"/>
         <w:adjustRightInd/>
         <w:snapToGrid/>
-        <w:spacing w:before="240" w:line="260" w:lineRule="auto"/>
+        <w:spacing w:before="200" w:line="260" w:lineRule="auto"/>
         <w:textAlignment w:val="auto"/>
         <w:rPr>
           <w:rFonts w:hint="default"/>
@@ -4699,7 +4862,7 @@
         <w:bidi w:val="0"/>
         <w:adjustRightInd/>
         <w:snapToGrid/>
-        <w:spacing w:before="240" w:line="260" w:lineRule="auto"/>
+        <w:spacing w:before="200" w:line="260" w:lineRule="auto"/>
         <w:textAlignment w:val="auto"/>
         <w:rPr>
           <w:rFonts w:hint="default"/>
@@ -4709,7 +4872,15 @@
         <w:rPr>
           <w:rFonts w:hint="default"/>
         </w:rPr>
-        <w:t>Essa verificação custa O(n), mas ainda assim é melhor do que ter que ordenar o vetor inteiro, que custaria O(n log n). Como a checagem é feita no vetor todo, não tem risco de erro.</w:t>
+        <w:t>Essa verificação custa O(n), mas ainda assim é melhor do que ter que ordenar o vetor inteiro, que custaria O(n log n). Como a checagem é feita no vetor</w:t>
+      </w:r>
+      <w:bookmarkStart w:id="0" w:name="_GoBack"/>
+      <w:bookmarkEnd w:id="0"/>
+      <w:r>
+        <w:rPr>
+          <w:rFonts w:hint="default"/>
+        </w:rPr>
+        <w:t xml:space="preserve"> todo, não tem risco de erro.</w:t>
       </w:r>
     </w:p>
     <w:p>
@@ -4727,30 +4898,8 @@
         <w:bidi w:val="0"/>
         <w:adjustRightInd/>
         <w:snapToGrid/>
-        <w:spacing w:before="240" w:line="260" w:lineRule="auto"/>
+        <w:spacing w:before="200" w:line="260" w:lineRule="auto"/>
         <w:textAlignment w:val="auto"/>
-        <w:rPr>
-          <w:rFonts w:hint="default"/>
-        </w:rPr>
-      </w:pPr>
-      <w:r>
-        <w:rPr>
-          <w:rFonts w:hint="default"/>
-        </w:rPr>
-        <w:t>No final, dá pra ver que a busca binária é bem mais eficiente, desde que essa condição inicial seja atendida.</w:t>
-      </w:r>
-    </w:p>
-    <w:p>
-      <w:pPr>
-        <w:rPr>
-          <w:rFonts w:hint="default"/>
-          <w:lang w:val="pt-BR"/>
-        </w:rPr>
-      </w:pPr>
-    </w:p>
-    <w:p>
-      <w:pPr>
-        <w:spacing w:line="360" w:lineRule="auto"/>
         <w:rPr>
           <w:rFonts w:hint="default"/>
           <w:b/>
@@ -4758,6 +4907,19 @@
           <w:lang w:val="pt-BR"/>
         </w:rPr>
       </w:pPr>
+      <w:r>
+        <w:rPr>
+          <w:rFonts w:hint="default"/>
+        </w:rPr>
+        <w:t>No final, dá pra ver que a busca binária é bem mais eficiente, desde que essa condição inicial seja atendida.</w:t>
+      </w:r>
+      <w:r>
+        <w:rPr>
+          <w:rFonts w:hint="default"/>
+          <w:lang w:val="pt-BR"/>
+        </w:rPr>
+        <w:t xml:space="preserve"> </w:t>
+      </w:r>
       <w:r>
         <w:rPr>
           <w:rFonts w:hint="default"/>
@@ -4770,21 +4932,19 @@
     </w:p>
     <w:p>
       <w:pPr>
+        <w:spacing w:line="360" w:lineRule="auto"/>
+        <w:jc w:val="center"/>
         <w:rPr>
           <w:rFonts w:hint="default"/>
           <w:lang w:val="pt-BR"/>
         </w:rPr>
       </w:pPr>
       <w:r>
-        <w:rPr>
-          <w:rFonts w:hint="default"/>
-          <w:lang w:val="pt-BR"/>
-        </w:rPr>
         <w:drawing>
           <wp:inline distT="0" distB="0" distL="114300" distR="114300">
-            <wp:extent cx="3128645" cy="1616075"/>
-            <wp:effectExtent l="0" t="0" r="14605" b="3175"/>
-            <wp:docPr id="33" name="Picture 33" descr="1-a1"/>
+            <wp:extent cx="2653030" cy="2938780"/>
+            <wp:effectExtent l="0" t="0" r="13970" b="13970"/>
+            <wp:docPr id="45" name="Picture 2"/>
             <wp:cNvGraphicFramePr>
               <a:graphicFrameLocks xmlns:a="http://schemas.openxmlformats.org/drawingml/2006/main" noChangeAspect="1"/>
             </wp:cNvGraphicFramePr>
@@ -4792,7 +4952,7 @@
               <a:graphicData uri="http://schemas.openxmlformats.org/drawingml/2006/picture">
                 <pic:pic xmlns:pic="http://schemas.openxmlformats.org/drawingml/2006/picture">
                   <pic:nvPicPr>
-                    <pic:cNvPr id="33" name="Picture 33" descr="1-a1"/>
+                    <pic:cNvPr id="45" name="Picture 2"/>
                     <pic:cNvPicPr>
                       <a:picLocks noChangeAspect="1"/>
                     </pic:cNvPicPr>
@@ -4806,54 +4966,15 @@
                   <pic:spPr>
                     <a:xfrm>
                       <a:off x="0" y="0"/>
-                      <a:ext cx="3128645" cy="1616075"/>
+                      <a:ext cx="2653030" cy="2938780"/>
                     </a:xfrm>
                     <a:prstGeom prst="rect">
                       <a:avLst/>
                     </a:prstGeom>
-                  </pic:spPr>
-                </pic:pic>
-              </a:graphicData>
-            </a:graphic>
-          </wp:inline>
-        </w:drawing>
-      </w:r>
-      <w:r>
-        <w:rPr>
-          <w:rFonts w:hint="default"/>
-          <w:lang w:val="pt-BR"/>
-        </w:rPr>
-        <w:drawing>
-          <wp:inline distT="0" distB="0" distL="114300" distR="114300">
-            <wp:extent cx="3307715" cy="1615440"/>
-            <wp:effectExtent l="0" t="0" r="6985" b="3810"/>
-            <wp:docPr id="34" name="Picture 34" descr="1-a2"/>
-            <wp:cNvGraphicFramePr>
-              <a:graphicFrameLocks xmlns:a="http://schemas.openxmlformats.org/drawingml/2006/main" noChangeAspect="1"/>
-            </wp:cNvGraphicFramePr>
-            <a:graphic xmlns:a="http://schemas.openxmlformats.org/drawingml/2006/main">
-              <a:graphicData uri="http://schemas.openxmlformats.org/drawingml/2006/picture">
-                <pic:pic xmlns:pic="http://schemas.openxmlformats.org/drawingml/2006/picture">
-                  <pic:nvPicPr>
-                    <pic:cNvPr id="34" name="Picture 34" descr="1-a2"/>
-                    <pic:cNvPicPr>
-                      <a:picLocks noChangeAspect="1"/>
-                    </pic:cNvPicPr>
-                  </pic:nvPicPr>
-                  <pic:blipFill>
-                    <a:blip r:embed="rId7"/>
-                    <a:stretch>
-                      <a:fillRect/>
-                    </a:stretch>
-                  </pic:blipFill>
-                  <pic:spPr>
-                    <a:xfrm>
-                      <a:off x="0" y="0"/>
-                      <a:ext cx="3307715" cy="1615440"/>
-                    </a:xfrm>
-                    <a:prstGeom prst="rect">
-                      <a:avLst/>
-                    </a:prstGeom>
+                    <a:noFill/>
+                    <a:ln>
+                      <a:noFill/>
+                    </a:ln>
                   </pic:spPr>
                 </pic:pic>
               </a:graphicData>
@@ -5069,7 +5190,7 @@
                     </pic:cNvPicPr>
                   </pic:nvPicPr>
                   <pic:blipFill>
-                    <a:blip r:embed="rId8"/>
+                    <a:blip r:embed="rId7"/>
                     <a:stretch>
                       <a:fillRect/>
                     </a:stretch>
@@ -5119,7 +5240,7 @@
                     </pic:cNvPicPr>
                   </pic:nvPicPr>
                   <pic:blipFill>
-                    <a:blip r:embed="rId9"/>
+                    <a:blip r:embed="rId8"/>
                     <a:stretch>
                       <a:fillRect/>
                     </a:stretch>
@@ -5150,6 +5271,7 @@
     </w:p>
     <w:p>
       <w:pPr>
+        <w:jc w:val="center"/>
         <w:rPr>
           <w:rFonts w:hint="default"/>
           <w:lang w:val="pt-BR"/>
@@ -5178,7 +5300,7 @@
                     </pic:cNvPicPr>
                   </pic:nvPicPr>
                   <pic:blipFill>
-                    <a:blip r:embed="rId10"/>
+                    <a:blip r:embed="rId9"/>
                     <a:stretch>
                       <a:fillRect/>
                     </a:stretch>
@@ -5198,6 +5320,19 @@
           </wp:inline>
         </w:drawing>
       </w:r>
+    </w:p>
+    <w:p>
+      <w:pPr>
+        <w:pStyle w:val="2"/>
+        <w:sectPr>
+          <w:pgSz w:w="11906" w:h="16838"/>
+          <w:pgMar w:top="851" w:right="851" w:bottom="851" w:left="851" w:header="709" w:footer="709" w:gutter="0"/>
+          <w:pgNumType w:start="0"/>
+          <w:cols w:space="708" w:num="1"/>
+          <w:titlePg/>
+          <w:docGrid w:linePitch="360" w:charSpace="0"/>
+        </w:sectPr>
+      </w:pPr>
     </w:p>
     <w:p>
       <w:pPr>
@@ -7335,8 +7470,8 @@
       <w:r>
         <w:drawing>
           <wp:inline distT="0" distB="0" distL="114300" distR="114300">
-            <wp:extent cx="3134995" cy="4541520"/>
-            <wp:effectExtent l="0" t="0" r="8255" b="11430"/>
+            <wp:extent cx="2501265" cy="3624580"/>
+            <wp:effectExtent l="0" t="0" r="13335" b="13970"/>
             <wp:docPr id="35" name="Picture 1"/>
             <wp:cNvGraphicFramePr>
               <a:graphicFrameLocks xmlns:a="http://schemas.openxmlformats.org/drawingml/2006/main" noChangeAspect="1"/>
@@ -7351,7 +7486,7 @@
                     </pic:cNvPicPr>
                   </pic:nvPicPr>
                   <pic:blipFill>
-                    <a:blip r:embed="rId11"/>
+                    <a:blip r:embed="rId10"/>
                     <a:stretch>
                       <a:fillRect/>
                     </a:stretch>
@@ -7359,7 +7494,7 @@
                   <pic:spPr>
                     <a:xfrm>
                       <a:off x="0" y="0"/>
-                      <a:ext cx="3134995" cy="4541520"/>
+                      <a:ext cx="2501265" cy="3624580"/>
                     </a:xfrm>
                     <a:prstGeom prst="rect">
                       <a:avLst/>
@@ -7509,7 +7644,6 @@
             <w:insideH w:val="none" w:color="auto" w:sz="0" w:space="0"/>
             <w:insideV w:val="none" w:color="auto" w:sz="0" w:space="0"/>
           </w:tblBorders>
-          <w:shd w:val="clear" w:color="auto" w:fill="auto"/>
           <w:tblCellMar>
             <w:top w:w="0" w:type="dxa"/>
             <w:left w:w="108" w:type="dxa"/>
@@ -7939,7 +8073,6 @@
             <w:insideH w:val="none" w:color="auto" w:sz="0" w:space="0"/>
             <w:insideV w:val="none" w:color="auto" w:sz="0" w:space="0"/>
           </w:tblBorders>
-          <w:shd w:val="clear" w:color="auto" w:fill="auto"/>
           <w:tblCellMar>
             <w:top w:w="0" w:type="dxa"/>
             <w:left w:w="108" w:type="dxa"/>
@@ -8300,7 +8433,7 @@
                     </pic:cNvPicPr>
                   </pic:nvPicPr>
                   <pic:blipFill>
-                    <a:blip r:embed="rId12"/>
+                    <a:blip r:embed="rId11"/>
                     <a:stretch>
                       <a:fillRect/>
                     </a:stretch>
@@ -8328,6 +8461,19 @@
     <w:p>
       <w:pPr>
         <w:pStyle w:val="2"/>
+        <w:sectPr>
+          <w:pgSz w:w="11906" w:h="16838"/>
+          <w:pgMar w:top="851" w:right="851" w:bottom="851" w:left="851" w:header="709" w:footer="709" w:gutter="0"/>
+          <w:pgNumType w:start="0"/>
+          <w:cols w:space="708" w:num="1"/>
+          <w:titlePg/>
+          <w:docGrid w:linePitch="360" w:charSpace="0"/>
+        </w:sectPr>
+      </w:pPr>
+    </w:p>
+    <w:p>
+      <w:pPr>
+        <w:pStyle w:val="2"/>
       </w:pPr>
       <w:r>
         <w:rPr>
@@ -8540,7 +8686,7 @@
                     </pic:cNvPicPr>
                   </pic:nvPicPr>
                   <pic:blipFill>
-                    <a:blip r:embed="rId13"/>
+                    <a:blip r:embed="rId12"/>
                     <a:stretch>
                       <a:fillRect/>
                     </a:stretch>
@@ -8564,6 +8710,19 @@
           </wp:inline>
         </w:drawing>
       </w:r>
+    </w:p>
+    <w:p>
+      <w:pPr>
+        <w:pStyle w:val="2"/>
+        <w:sectPr>
+          <w:pgSz w:w="11906" w:h="16838"/>
+          <w:pgMar w:top="851" w:right="851" w:bottom="851" w:left="851" w:header="709" w:footer="709" w:gutter="0"/>
+          <w:pgNumType w:start="0"/>
+          <w:cols w:space="708" w:num="1"/>
+          <w:titlePg/>
+          <w:docGrid w:linePitch="360" w:charSpace="0"/>
+        </w:sectPr>
+      </w:pPr>
     </w:p>
     <w:p>
       <w:pPr>
@@ -8840,6 +8999,7 @@
             <w:insideH w:val="none" w:color="auto" w:sz="0" w:space="0"/>
             <w:insideV w:val="none" w:color="auto" w:sz="0" w:space="0"/>
           </w:tblBorders>
+          <w:shd w:val="clear" w:color="auto" w:fill="auto"/>
           <w:tblCellMar>
             <w:top w:w="0" w:type="dxa"/>
             <w:left w:w="108" w:type="dxa"/>
@@ -10164,7 +10324,7 @@
                     </pic:cNvPicPr>
                   </pic:nvPicPr>
                   <pic:blipFill>
-                    <a:blip r:embed="rId14"/>
+                    <a:blip r:embed="rId13"/>
                     <a:stretch>
                       <a:fillRect/>
                     </a:stretch>
@@ -10188,6 +10348,19 @@
           </wp:inline>
         </w:drawing>
       </w:r>
+    </w:p>
+    <w:p>
+      <w:pPr>
+        <w:pStyle w:val="2"/>
+        <w:sectPr>
+          <w:pgSz w:w="11906" w:h="16838"/>
+          <w:pgMar w:top="851" w:right="851" w:bottom="851" w:left="851" w:header="709" w:footer="709" w:gutter="0"/>
+          <w:pgNumType w:start="0"/>
+          <w:cols w:space="708" w:num="1"/>
+          <w:titlePg/>
+          <w:docGrid w:linePitch="360" w:charSpace="0"/>
+        </w:sectPr>
+      </w:pPr>
     </w:p>
     <w:p>
       <w:pPr>
@@ -11150,7 +11323,6 @@
             <w:insideH w:val="none" w:color="auto" w:sz="0" w:space="0"/>
             <w:insideV w:val="none" w:color="auto" w:sz="0" w:space="0"/>
           </w:tblBorders>
-          <w:shd w:val="clear" w:color="auto" w:fill="auto"/>
           <w:tblCellMar>
             <w:top w:w="0" w:type="dxa"/>
             <w:left w:w="108" w:type="dxa"/>
@@ -11311,6 +11483,7 @@
             <w:insideH w:val="none" w:color="auto" w:sz="0" w:space="0"/>
             <w:insideV w:val="none" w:color="auto" w:sz="0" w:space="0"/>
           </w:tblBorders>
+          <w:shd w:val="clear" w:color="auto" w:fill="auto"/>
           <w:tblCellMar>
             <w:top w:w="0" w:type="dxa"/>
             <w:left w:w="108" w:type="dxa"/>
@@ -11793,7 +11966,6 @@
             <w:insideH w:val="none" w:color="auto" w:sz="0" w:space="0"/>
             <w:insideV w:val="none" w:color="auto" w:sz="0" w:space="0"/>
           </w:tblBorders>
-          <w:shd w:val="clear" w:color="auto" w:fill="auto"/>
           <w:tblCellMar>
             <w:top w:w="0" w:type="dxa"/>
             <w:left w:w="108" w:type="dxa"/>
@@ -12115,6 +12287,7 @@
             <w:insideH w:val="none" w:color="auto" w:sz="0" w:space="0"/>
             <w:insideV w:val="none" w:color="auto" w:sz="0" w:space="0"/>
           </w:tblBorders>
+          <w:shd w:val="clear" w:color="auto" w:fill="auto"/>
           <w:tblCellMar>
             <w:top w:w="0" w:type="dxa"/>
             <w:left w:w="108" w:type="dxa"/>
@@ -12431,26 +12604,6 @@
       <w:pPr>
         <w:rPr>
           <w:rFonts w:hint="default"/>
-          <w:b/>
-          <w:bCs/>
-          <w:lang w:val="pt-BR"/>
-        </w:rPr>
-      </w:pPr>
-    </w:p>
-    <w:p>
-      <w:pPr>
-        <w:rPr>
-          <w:rFonts w:hint="default"/>
-          <w:b/>
-          <w:bCs/>
-          <w:lang w:val="pt-BR"/>
-        </w:rPr>
-      </w:pPr>
-    </w:p>
-    <w:p>
-      <w:pPr>
-        <w:rPr>
-          <w:rFonts w:hint="default"/>
         </w:rPr>
       </w:pPr>
     </w:p>
@@ -12477,7 +12630,7 @@
                     </pic:cNvPicPr>
                   </pic:nvPicPr>
                   <pic:blipFill>
-                    <a:blip r:embed="rId15"/>
+                    <a:blip r:embed="rId14"/>
                     <a:stretch>
                       <a:fillRect/>
                     </a:stretch>
@@ -12505,6 +12658,19 @@
     <w:p>
       <w:pPr>
         <w:pStyle w:val="2"/>
+        <w:sectPr>
+          <w:pgSz w:w="11906" w:h="16838"/>
+          <w:pgMar w:top="851" w:right="851" w:bottom="851" w:left="851" w:header="709" w:footer="709" w:gutter="0"/>
+          <w:pgNumType w:start="0"/>
+          <w:cols w:space="708" w:num="1"/>
+          <w:titlePg/>
+          <w:docGrid w:linePitch="360" w:charSpace="0"/>
+        </w:sectPr>
+      </w:pPr>
+    </w:p>
+    <w:p>
+      <w:pPr>
+        <w:pStyle w:val="2"/>
       </w:pPr>
       <w:r>
         <w:rPr>
@@ -12608,6 +12774,7 @@
     </w:p>
     <w:tbl>
       <w:tblPr>
+        <w:tblStyle w:val="6"/>
         <w:tblW w:w="6075" w:type="dxa"/>
         <w:jc w:val="center"/>
         <w:tblBorders>
@@ -12618,7 +12785,7 @@
           <w:insideH w:val="none" w:color="auto" w:sz="0" w:space="0"/>
           <w:insideV w:val="none" w:color="auto" w:sz="0" w:space="0"/>
         </w:tblBorders>
-        <w:shd w:val="clear"/>
+        <w:shd w:val="clear" w:color="auto" w:fill="auto"/>
         <w:tblLayout w:type="autofit"/>
         <w:tblCellMar>
           <w:top w:w="0" w:type="dxa"/>
@@ -12643,7 +12810,6 @@
             <w:insideH w:val="none" w:color="auto" w:sz="0" w:space="0"/>
             <w:insideV w:val="none" w:color="auto" w:sz="0" w:space="0"/>
           </w:tblBorders>
-          <w:shd w:val="clear"/>
           <w:tblCellMar>
             <w:top w:w="0" w:type="dxa"/>
             <w:left w:w="108" w:type="dxa"/>
@@ -12664,7 +12830,7 @@
               <w:bottom w:val="single" w:color="000000" w:sz="8" w:space="0"/>
               <w:right w:val="single" w:color="000000" w:sz="4" w:space="0"/>
             </w:tcBorders>
-            <w:shd w:val="clear"/>
+            <w:shd w:val="clear" w:color="auto" w:fill="auto"/>
             <w:vAlign w:val="center"/>
           </w:tcPr>
           <w:p>
@@ -12699,7 +12865,6 @@
                 <w:sz w:val="22"/>
                 <w:szCs w:val="22"/>
                 <w:u w:val="none"/>
-                <w:bdr w:val="none" w:color="auto" w:sz="0" w:space="0"/>
                 <w:lang w:val="en-US" w:eastAsia="zh-CN" w:bidi="ar"/>
               </w:rPr>
               <w:t>Tipo</w:t>
@@ -12715,7 +12880,7 @@
               <w:bottom w:val="single" w:color="000000" w:sz="8" w:space="0"/>
               <w:right w:val="single" w:color="000000" w:sz="4" w:space="0"/>
             </w:tcBorders>
-            <w:shd w:val="clear"/>
+            <w:shd w:val="clear" w:color="auto" w:fill="auto"/>
             <w:vAlign w:val="center"/>
           </w:tcPr>
           <w:p>
@@ -12750,7 +12915,6 @@
                 <w:sz w:val="22"/>
                 <w:szCs w:val="22"/>
                 <w:u w:val="none"/>
-                <w:bdr w:val="none" w:color="auto" w:sz="0" w:space="0"/>
                 <w:lang w:val="en-US" w:eastAsia="zh-CN" w:bidi="ar"/>
               </w:rPr>
               <w:t>Valor</w:t>
@@ -12766,7 +12930,7 @@
               <w:bottom w:val="single" w:color="000000" w:sz="8" w:space="0"/>
               <w:right w:val="single" w:color="000000" w:sz="4" w:space="0"/>
             </w:tcBorders>
-            <w:shd w:val="clear"/>
+            <w:shd w:val="clear" w:color="auto" w:fill="auto"/>
             <w:vAlign w:val="center"/>
           </w:tcPr>
           <w:p>
@@ -12801,7 +12965,6 @@
                 <w:sz w:val="22"/>
                 <w:szCs w:val="22"/>
                 <w:u w:val="none"/>
-                <w:bdr w:val="none" w:color="auto" w:sz="0" w:space="0"/>
                 <w:lang w:val="en-US" w:eastAsia="zh-CN" w:bidi="ar"/>
               </w:rPr>
               <w:t>Chamadas</w:t>
@@ -12817,7 +12980,7 @@
               <w:bottom w:val="single" w:color="000000" w:sz="8" w:space="0"/>
               <w:right w:val="single" w:color="000000" w:sz="8" w:space="0"/>
             </w:tcBorders>
-            <w:shd w:val="clear"/>
+            <w:shd w:val="clear" w:color="auto" w:fill="auto"/>
             <w:vAlign w:val="center"/>
           </w:tcPr>
           <w:p>
@@ -12852,7 +13015,6 @@
                 <w:sz w:val="22"/>
                 <w:szCs w:val="22"/>
                 <w:u w:val="none"/>
-                <w:bdr w:val="none" w:color="auto" w:sz="0" w:space="0"/>
                 <w:lang w:val="en-US" w:eastAsia="zh-CN" w:bidi="ar"/>
               </w:rPr>
               <w:t>Subproblemas</w:t>
@@ -12870,7 +13032,6 @@
             <w:insideH w:val="none" w:color="auto" w:sz="0" w:space="0"/>
             <w:insideV w:val="none" w:color="auto" w:sz="0" w:space="0"/>
           </w:tblBorders>
-          <w:shd w:val="clear"/>
           <w:tblCellMar>
             <w:top w:w="0" w:type="dxa"/>
             <w:left w:w="108" w:type="dxa"/>
@@ -12891,7 +13052,7 @@
               <w:bottom w:val="dotDash" w:color="000000" w:sz="4" w:space="0"/>
               <w:right w:val="single" w:color="000000" w:sz="4" w:space="0"/>
             </w:tcBorders>
-            <w:shd w:val="clear"/>
+            <w:shd w:val="clear" w:color="auto" w:fill="auto"/>
             <w:vAlign w:val="center"/>
           </w:tcPr>
           <w:p>
@@ -12922,7 +13083,6 @@
                 <w:sz w:val="22"/>
                 <w:szCs w:val="22"/>
                 <w:u w:val="none"/>
-                <w:bdr w:val="none" w:color="auto" w:sz="0" w:space="0"/>
                 <w:lang w:val="en-US" w:eastAsia="zh-CN" w:bidi="ar"/>
               </w:rPr>
               <w:t>Recursivo</w:t>
@@ -12938,7 +13098,7 @@
               <w:bottom w:val="dotDash" w:color="000000" w:sz="4" w:space="0"/>
               <w:right w:val="single" w:color="000000" w:sz="4" w:space="0"/>
             </w:tcBorders>
-            <w:shd w:val="clear"/>
+            <w:shd w:val="clear" w:color="auto" w:fill="auto"/>
             <w:vAlign w:val="center"/>
           </w:tcPr>
           <w:p>
@@ -12969,7 +13129,6 @@
                 <w:sz w:val="22"/>
                 <w:szCs w:val="22"/>
                 <w:u w:val="none"/>
-                <w:bdr w:val="none" w:color="auto" w:sz="0" w:space="0"/>
                 <w:lang w:val="en-US" w:eastAsia="zh-CN" w:bidi="ar"/>
               </w:rPr>
               <w:t>225</w:t>
@@ -12985,7 +13144,7 @@
               <w:bottom w:val="dotDash" w:color="000000" w:sz="4" w:space="0"/>
               <w:right w:val="single" w:color="000000" w:sz="4" w:space="0"/>
             </w:tcBorders>
-            <w:shd w:val="clear"/>
+            <w:shd w:val="clear" w:color="auto" w:fill="auto"/>
             <w:vAlign w:val="center"/>
           </w:tcPr>
           <w:p>
@@ -13016,7 +13175,6 @@
                 <w:sz w:val="22"/>
                 <w:szCs w:val="22"/>
                 <w:u w:val="none"/>
-                <w:bdr w:val="none" w:color="auto" w:sz="0" w:space="0"/>
                 <w:lang w:val="en-US" w:eastAsia="zh-CN" w:bidi="ar"/>
               </w:rPr>
               <w:t>13897</w:t>
@@ -13032,7 +13190,7 @@
               <w:bottom w:val="dotDash" w:color="000000" w:sz="4" w:space="0"/>
               <w:right w:val="single" w:color="000000" w:sz="8" w:space="0"/>
             </w:tcBorders>
-            <w:shd w:val="clear"/>
+            <w:shd w:val="clear" w:color="auto" w:fill="auto"/>
             <w:vAlign w:val="center"/>
           </w:tcPr>
           <w:p>
@@ -13063,7 +13221,6 @@
                 <w:sz w:val="22"/>
                 <w:szCs w:val="22"/>
                 <w:u w:val="none"/>
-                <w:bdr w:val="none" w:color="auto" w:sz="0" w:space="0"/>
                 <w:lang w:val="en-US" w:eastAsia="zh-CN" w:bidi="ar"/>
               </w:rPr>
               <w:t>275</w:t>
@@ -13081,7 +13238,6 @@
             <w:insideH w:val="none" w:color="auto" w:sz="0" w:space="0"/>
             <w:insideV w:val="none" w:color="auto" w:sz="0" w:space="0"/>
           </w:tblBorders>
-          <w:shd w:val="clear"/>
           <w:tblCellMar>
             <w:top w:w="0" w:type="dxa"/>
             <w:left w:w="108" w:type="dxa"/>
@@ -13102,7 +13258,7 @@
               <w:bottom w:val="single" w:color="000000" w:sz="8" w:space="0"/>
               <w:right w:val="single" w:color="000000" w:sz="4" w:space="0"/>
             </w:tcBorders>
-            <w:shd w:val="clear"/>
+            <w:shd w:val="clear" w:color="auto" w:fill="auto"/>
             <w:vAlign w:val="center"/>
           </w:tcPr>
           <w:p>
@@ -13133,7 +13289,6 @@
                 <w:sz w:val="22"/>
                 <w:szCs w:val="22"/>
                 <w:u w:val="none"/>
-                <w:bdr w:val="none" w:color="auto" w:sz="0" w:space="0"/>
                 <w:lang w:val="en-US" w:eastAsia="zh-CN" w:bidi="ar"/>
               </w:rPr>
               <w:t>Com memoization</w:t>
@@ -13149,7 +13304,7 @@
               <w:bottom w:val="single" w:color="000000" w:sz="8" w:space="0"/>
               <w:right w:val="single" w:color="000000" w:sz="4" w:space="0"/>
             </w:tcBorders>
-            <w:shd w:val="clear"/>
+            <w:shd w:val="clear" w:color="auto" w:fill="auto"/>
             <w:vAlign w:val="center"/>
           </w:tcPr>
           <w:p>
@@ -13180,7 +13335,6 @@
                 <w:sz w:val="22"/>
                 <w:szCs w:val="22"/>
                 <w:u w:val="none"/>
-                <w:bdr w:val="none" w:color="auto" w:sz="0" w:space="0"/>
                 <w:lang w:val="en-US" w:eastAsia="zh-CN" w:bidi="ar"/>
               </w:rPr>
               <w:t>225</w:t>
@@ -13196,7 +13350,7 @@
               <w:bottom w:val="single" w:color="000000" w:sz="8" w:space="0"/>
               <w:right w:val="single" w:color="000000" w:sz="4" w:space="0"/>
             </w:tcBorders>
-            <w:shd w:val="clear"/>
+            <w:shd w:val="clear" w:color="auto" w:fill="auto"/>
             <w:vAlign w:val="center"/>
           </w:tcPr>
           <w:p>
@@ -13227,7 +13381,6 @@
                 <w:sz w:val="22"/>
                 <w:szCs w:val="22"/>
                 <w:u w:val="none"/>
-                <w:bdr w:val="none" w:color="auto" w:sz="0" w:space="0"/>
                 <w:lang w:val="en-US" w:eastAsia="zh-CN" w:bidi="ar"/>
               </w:rPr>
               <w:t>449</w:t>
@@ -13243,7 +13396,7 @@
               <w:bottom w:val="single" w:color="000000" w:sz="8" w:space="0"/>
               <w:right w:val="single" w:color="000000" w:sz="8" w:space="0"/>
             </w:tcBorders>
-            <w:shd w:val="clear"/>
+            <w:shd w:val="clear" w:color="auto" w:fill="auto"/>
             <w:vAlign w:val="center"/>
           </w:tcPr>
           <w:p>
@@ -13274,7 +13427,6 @@
                 <w:sz w:val="22"/>
                 <w:szCs w:val="22"/>
                 <w:u w:val="none"/>
-                <w:bdr w:val="none" w:color="auto" w:sz="0" w:space="0"/>
                 <w:lang w:val="en-US" w:eastAsia="zh-CN" w:bidi="ar"/>
               </w:rPr>
               <w:t>-</w:t>
@@ -13359,8 +13511,6 @@
           <w:lang w:val="pt-BR"/>
         </w:rPr>
       </w:pPr>
-      <w:bookmarkStart w:id="0" w:name="_GoBack"/>
-      <w:bookmarkEnd w:id="0"/>
     </w:p>
     <w:p>
       <w:pPr>
@@ -13397,7 +13547,7 @@
                     </pic:cNvPicPr>
                   </pic:nvPicPr>
                   <pic:blipFill>
-                    <a:blip r:embed="rId16"/>
+                    <a:blip r:embed="rId15"/>
                     <a:stretch>
                       <a:fillRect/>
                     </a:stretch>
@@ -14519,7 +14669,13 @@
 
 <file path=customXml/item1.xml><?xml version="1.0" encoding="utf-8"?>
 <s:customData xmlns="http://www.wps.cn/officeDocument/2013/wpsCustomData" xmlns:s="http://www.wps.cn/officeDocument/2013/wpsCustomData">
-  <customSectProps/>
+  <customSectProps>
+    <customSectPr/>
+    <customSectPr/>
+    <customSectPr/>
+    <customSectPr/>
+    <customSectPr/>
+  </customSectProps>
   <customShpExts>
     <customShpInfo spid="_x0000_s1026" textRotate="1"/>
   </customShpExts>

</xml_diff>